<commit_message>
added my results from the html and accessibility tools
</commit_message>
<xml_diff>
--- a/UCC2_P2A2_stuname_stuid.docx
+++ b/UCC2_P2A2_stuname_stuid.docx
@@ -10,7 +10,6 @@
         <w:tblCellMar>
           <w:top w:w="50" w:type="dxa"/>
           <w:left w:w="9" w:type="dxa"/>
-          <w:bottom w:w="0" w:type="dxa"/>
           <w:right w:w="115" w:type="dxa"/>
         </w:tblCellMar>
         <w:tblLook w:val="04A0" w:firstRow="1" w:lastRow="0" w:firstColumn="1" w:lastColumn="0" w:noHBand="0" w:noVBand="1"/>
@@ -105,7 +104,7 @@
           </w:p>
           <w:p>
             <w:pPr>
-              <w:spacing w:after="0" w:line="272" w:lineRule="auto"/>
+              <w:spacing w:line="272" w:lineRule="auto"/>
               <w:ind w:right="2942" w:firstLine="4022"/>
               <w:rPr>
                 <w:b/>
@@ -124,7 +123,7 @@
           </w:p>
           <w:p>
             <w:pPr>
-              <w:spacing w:after="0" w:line="272" w:lineRule="auto"/>
+              <w:spacing w:line="272" w:lineRule="auto"/>
               <w:ind w:right="2942" w:firstLine="4022"/>
               <w:rPr>
                 <w:b/>
@@ -159,7 +158,7 @@
           </w:p>
           <w:p>
             <w:pPr>
-              <w:spacing w:after="0" w:line="272" w:lineRule="auto"/>
+              <w:spacing w:line="272" w:lineRule="auto"/>
               <w:ind w:right="2942"/>
             </w:pPr>
             <w:r>
@@ -170,6 +169,7 @@
               </w:rPr>
               <w:t xml:space="preserve">Project Name: </w:t>
             </w:r>
+            <w:proofErr w:type="spellStart"/>
             <w:r>
               <w:rPr>
                 <w:b/>
@@ -178,6 +178,7 @@
               </w:rPr>
               <w:t>YourAverageGamer</w:t>
             </w:r>
+            <w:proofErr w:type="spellEnd"/>
           </w:p>
           <w:p>
             <w:pPr>
@@ -234,7 +235,7 @@
           </w:p>
           <w:p>
             <w:pPr>
-              <w:spacing w:after="0" w:line="270" w:lineRule="auto"/>
+              <w:spacing w:line="270" w:lineRule="auto"/>
               <w:ind w:right="4678"/>
               <w:rPr>
                 <w:color w:val="1D2125"/>
@@ -247,15 +248,16 @@
                 <w:color w:val="1D2125"/>
                 <w:sz w:val="24"/>
               </w:rPr>
-              <w:t>Team’s Project Githu</w:t>
-            </w:r>
+              <w:t xml:space="preserve">Team’s Project </w:t>
+            </w:r>
+            <w:proofErr w:type="spellStart"/>
             <w:r>
               <w:rPr>
                 <w:b/>
                 <w:color w:val="1D2125"/>
                 <w:sz w:val="24"/>
               </w:rPr>
-              <w:t xml:space="preserve">b </w:t>
+              <w:t>Githu</w:t>
             </w:r>
             <w:r>
               <w:rPr>
@@ -263,8 +265,9 @@
                 <w:color w:val="1D2125"/>
                 <w:sz w:val="24"/>
               </w:rPr>
-              <w:t>repo URL:</w:t>
-            </w:r>
+              <w:t>b</w:t>
+            </w:r>
+            <w:proofErr w:type="spellEnd"/>
             <w:r>
               <w:rPr>
                 <w:b/>
@@ -279,21 +282,15 @@
                 <w:color w:val="1D2125"/>
                 <w:sz w:val="24"/>
               </w:rPr>
-              <w:t>https://github.com/jermainej-uwg/P1A6_UCC2.git</w:t>
-            </w:r>
-          </w:p>
-          <w:p>
-            <w:pPr>
-              <w:spacing w:after="0" w:line="270" w:lineRule="auto"/>
-              <w:ind w:right="4678"/>
-            </w:pPr>
+              <w:t>repo URL:</w:t>
+            </w:r>
             <w:r>
               <w:rPr>
                 <w:b/>
                 <w:color w:val="1D2125"/>
                 <w:sz w:val="24"/>
               </w:rPr>
-              <w:t>Website UR</w:t>
+              <w:t xml:space="preserve"> </w:t>
             </w:r>
             <w:r>
               <w:rPr>
@@ -301,21 +298,40 @@
                 <w:color w:val="1D2125"/>
                 <w:sz w:val="24"/>
               </w:rPr>
-              <w:t>L: https://black-minta-52.tiiny.site</w:t>
-            </w:r>
+              <w:t>https://github.com/jermainej-uwg/P1A6_UCC2.git</w:t>
+            </w:r>
+          </w:p>
+          <w:p>
+            <w:pPr>
+              <w:spacing w:line="270" w:lineRule="auto"/>
+              <w:ind w:right="4678"/>
+            </w:pPr>
             <w:r>
               <w:rPr>
                 <w:b/>
                 <w:color w:val="1D2125"/>
                 <w:sz w:val="24"/>
               </w:rPr>
+              <w:t>Website UR</w:t>
+            </w:r>
+            <w:r>
+              <w:rPr>
+                <w:b/>
+                <w:color w:val="1D2125"/>
+                <w:sz w:val="24"/>
+              </w:rPr>
+              <w:t>L: https://black-minta-52.tiiny.site</w:t>
+            </w:r>
+            <w:r>
+              <w:rPr>
+                <w:b/>
+                <w:color w:val="1D2125"/>
+                <w:sz w:val="24"/>
+              </w:rPr>
               <w:t xml:space="preserve">  </w:t>
             </w:r>
           </w:p>
           <w:p>
-            <w:pPr>
-              <w:spacing w:after="0"/>
-            </w:pPr>
             <w:r>
               <w:rPr>
                 <w:b/>
@@ -343,7 +359,6 @@
           </w:tcPr>
           <w:p>
             <w:pPr>
-              <w:spacing w:after="0"/>
               <w:ind w:left="100"/>
             </w:pPr>
             <w:r>
@@ -373,7 +388,6 @@
           </w:tcPr>
           <w:p>
             <w:pPr>
-              <w:spacing w:after="0"/>
               <w:ind w:left="81"/>
             </w:pPr>
             <w:r>
@@ -421,7 +435,6 @@
           </w:tcPr>
           <w:p>
             <w:pPr>
-              <w:spacing w:after="0"/>
               <w:ind w:left="100"/>
             </w:pPr>
             <w:r>
@@ -444,7 +457,6 @@
           </w:tcPr>
           <w:p>
             <w:pPr>
-              <w:spacing w:after="0"/>
               <w:ind w:left="81"/>
             </w:pPr>
             <w:r>
@@ -485,7 +497,6 @@
           </w:tcPr>
           <w:p>
             <w:pPr>
-              <w:spacing w:after="0"/>
               <w:ind w:left="100"/>
             </w:pPr>
             <w:r>
@@ -508,7 +519,6 @@
           </w:tcPr>
           <w:p>
             <w:pPr>
-              <w:spacing w:after="0"/>
               <w:ind w:left="81"/>
             </w:pPr>
           </w:p>
@@ -543,7 +553,6 @@
           </w:tcPr>
           <w:p>
             <w:pPr>
-              <w:spacing w:after="0"/>
               <w:ind w:left="100"/>
             </w:pPr>
             <w:r>
@@ -566,7 +575,6 @@
           </w:tcPr>
           <w:p>
             <w:pPr>
-              <w:spacing w:after="0"/>
               <w:ind w:left="81"/>
             </w:pPr>
             <w:r>
@@ -607,7 +615,6 @@
           </w:tcPr>
           <w:p>
             <w:pPr>
-              <w:spacing w:after="0"/>
               <w:ind w:left="100"/>
             </w:pPr>
             <w:r>
@@ -630,7 +637,6 @@
           </w:tcPr>
           <w:p>
             <w:pPr>
-              <w:spacing w:after="0"/>
               <w:ind w:left="81"/>
             </w:pPr>
             <w:r>
@@ -677,7 +683,6 @@
         <w:tblCellMar>
           <w:top w:w="50" w:type="dxa"/>
           <w:left w:w="11" w:type="dxa"/>
-          <w:bottom w:w="0" w:type="dxa"/>
           <w:right w:w="115" w:type="dxa"/>
         </w:tblCellMar>
         <w:tblLook w:val="04A0" w:firstRow="1" w:lastRow="0" w:firstColumn="1" w:lastColumn="0" w:noHBand="0" w:noVBand="1"/>
@@ -703,9 +708,6 @@
             <w:shd w:val="clear" w:color="auto" w:fill="F8F9FA"/>
           </w:tcPr>
           <w:p>
-            <w:pPr>
-              <w:spacing w:after="0"/>
-            </w:pPr>
             <w:r>
               <w:rPr>
                 <w:b/>
@@ -733,7 +735,6 @@
           </w:tcPr>
           <w:p>
             <w:pPr>
-              <w:spacing w:after="0"/>
               <w:ind w:left="115"/>
             </w:pPr>
             <w:r>
@@ -757,7 +758,6 @@
           </w:tcPr>
           <w:p>
             <w:pPr>
-              <w:spacing w:after="0"/>
               <w:ind w:left="99"/>
             </w:pPr>
             <w:r>
@@ -782,7 +782,6 @@
           </w:tcPr>
           <w:p>
             <w:pPr>
-              <w:spacing w:after="0"/>
               <w:ind w:left="115"/>
             </w:pPr>
             <w:r>
@@ -806,7 +805,6 @@
           </w:tcPr>
           <w:p>
             <w:pPr>
-              <w:spacing w:after="0"/>
               <w:ind w:left="99"/>
             </w:pPr>
             <w:r>
@@ -814,14 +812,7 @@
                 <w:rFonts w:ascii="Arial" w:eastAsia="Arial" w:hAnsi="Arial" w:cs="Arial"/>
                 <w:i/>
               </w:rPr>
-              <w:t>30</w:t>
-            </w:r>
-            <w:r>
-              <w:rPr>
-                <w:rFonts w:ascii="Arial" w:eastAsia="Arial" w:hAnsi="Arial" w:cs="Arial"/>
-                <w:i/>
-              </w:rPr>
-              <w:t xml:space="preserve"> </w:t>
+              <w:t xml:space="preserve">30 </w:t>
             </w:r>
           </w:p>
         </w:tc>
@@ -842,7 +833,6 @@
           </w:tcPr>
           <w:p>
             <w:pPr>
-              <w:spacing w:after="0"/>
               <w:ind w:left="115"/>
             </w:pPr>
             <w:r>
@@ -866,7 +856,6 @@
           </w:tcPr>
           <w:p>
             <w:pPr>
-              <w:spacing w:after="0"/>
               <w:ind w:left="99"/>
             </w:pPr>
             <w:r>
@@ -874,14 +863,7 @@
                 <w:rFonts w:ascii="Arial" w:eastAsia="Arial" w:hAnsi="Arial" w:cs="Arial"/>
                 <w:i/>
               </w:rPr>
-              <w:t>Male</w:t>
-            </w:r>
-            <w:r>
-              <w:rPr>
-                <w:rFonts w:ascii="Arial" w:eastAsia="Arial" w:hAnsi="Arial" w:cs="Arial"/>
-                <w:i/>
-              </w:rPr>
-              <w:t xml:space="preserve"> </w:t>
+              <w:t xml:space="preserve">Male </w:t>
             </w:r>
           </w:p>
         </w:tc>
@@ -902,7 +884,6 @@
           </w:tcPr>
           <w:p>
             <w:pPr>
-              <w:spacing w:after="0"/>
               <w:ind w:left="115"/>
             </w:pPr>
             <w:r>
@@ -926,7 +907,6 @@
           </w:tcPr>
           <w:p>
             <w:pPr>
-              <w:spacing w:after="0"/>
               <w:ind w:left="99"/>
             </w:pPr>
             <w:r>
@@ -955,7 +935,6 @@
           </w:tcPr>
           <w:p>
             <w:pPr>
-              <w:spacing w:after="0"/>
               <w:ind w:left="115"/>
             </w:pPr>
             <w:r>
@@ -979,7 +958,6 @@
           </w:tcPr>
           <w:p>
             <w:pPr>
-              <w:spacing w:after="0"/>
               <w:ind w:left="99"/>
             </w:pPr>
             <w:r>
@@ -987,14 +965,7 @@
                 <w:rFonts w:ascii="Arial" w:eastAsia="Arial" w:hAnsi="Arial" w:cs="Arial"/>
                 <w:i/>
               </w:rPr>
-              <w:t>9:30am</w:t>
-            </w:r>
-            <w:r>
-              <w:rPr>
-                <w:rFonts w:ascii="Arial" w:eastAsia="Arial" w:hAnsi="Arial" w:cs="Arial"/>
-                <w:i/>
-              </w:rPr>
-              <w:t xml:space="preserve"> </w:t>
+              <w:t xml:space="preserve">9:30am </w:t>
             </w:r>
           </w:p>
         </w:tc>
@@ -1015,7 +986,6 @@
           </w:tcPr>
           <w:p>
             <w:pPr>
-              <w:spacing w:after="0"/>
               <w:ind w:left="115"/>
             </w:pPr>
             <w:r>
@@ -1039,7 +1009,6 @@
           </w:tcPr>
           <w:p>
             <w:pPr>
-              <w:spacing w:after="0"/>
               <w:ind w:left="99"/>
             </w:pPr>
             <w:r>
@@ -1069,7 +1038,6 @@
           </w:tcPr>
           <w:p>
             <w:pPr>
-              <w:spacing w:after="0"/>
               <w:ind w:left="114"/>
               <w:jc w:val="center"/>
             </w:pPr>
@@ -1100,7 +1068,7 @@
           </w:tcPr>
           <w:p>
             <w:pPr>
-              <w:spacing w:after="0" w:line="242" w:lineRule="auto"/>
+              <w:spacing w:line="242" w:lineRule="auto"/>
               <w:ind w:left="115"/>
               <w:rPr>
                 <w:rFonts w:ascii="Arial" w:eastAsia="Arial" w:hAnsi="Arial" w:cs="Arial"/>
@@ -1132,7 +1100,7 @@
           </w:p>
           <w:p>
             <w:pPr>
-              <w:spacing w:after="0" w:line="242" w:lineRule="auto"/>
+              <w:spacing w:line="242" w:lineRule="auto"/>
               <w:ind w:left="115"/>
               <w:rPr>
                 <w:rFonts w:ascii="Arial" w:eastAsia="Arial" w:hAnsi="Arial" w:cs="Arial"/>
@@ -1144,7 +1112,23 @@
                 <w:rFonts w:ascii="Arial" w:eastAsia="Arial" w:hAnsi="Arial" w:cs="Arial"/>
                 <w:i/>
               </w:rPr>
-              <w:t>This isn’t a test of you more so it’s a test of the website. I just want to see how people naturally use it and what parts feel easy or confusing. The site is called YourAverageGamer, and it focuses on gaming content like reviews and community posts. I won’t give too many details because I’d like you to explore it freely.</w:t>
+              <w:t xml:space="preserve">This isn’t a test of you more so it’s a test of the website. I just want to see how people naturally use it and what parts feel easy or confusing. The site is called </w:t>
+            </w:r>
+            <w:proofErr w:type="spellStart"/>
+            <w:r>
+              <w:rPr>
+                <w:rFonts w:ascii="Arial" w:eastAsia="Arial" w:hAnsi="Arial" w:cs="Arial"/>
+                <w:i/>
+              </w:rPr>
+              <w:t>YourAverageGamer</w:t>
+            </w:r>
+            <w:proofErr w:type="spellEnd"/>
+            <w:r>
+              <w:rPr>
+                <w:rFonts w:ascii="Arial" w:eastAsia="Arial" w:hAnsi="Arial" w:cs="Arial"/>
+                <w:i/>
+              </w:rPr>
+              <w:t>, and it focuses on gaming content like reviews and community posts. I won’t give too many details because I’d like you to explore it freely.</w:t>
             </w:r>
             <w:r>
               <w:rPr>
@@ -1185,7 +1169,6 @@
         <w:tblCellMar>
           <w:top w:w="50" w:type="dxa"/>
           <w:left w:w="110" w:type="dxa"/>
-          <w:bottom w:w="0" w:type="dxa"/>
           <w:right w:w="57" w:type="dxa"/>
         </w:tblCellMar>
         <w:tblLook w:val="04A0" w:firstRow="1" w:lastRow="0" w:firstColumn="1" w:lastColumn="0" w:noHBand="0" w:noVBand="1"/>
@@ -1211,7 +1194,6 @@
           </w:tcPr>
           <w:p>
             <w:pPr>
-              <w:spacing w:after="0"/>
               <w:ind w:right="53"/>
               <w:jc w:val="center"/>
             </w:pPr>
@@ -1225,7 +1207,6 @@
           </w:p>
           <w:p>
             <w:pPr>
-              <w:spacing w:after="0"/>
               <w:ind w:left="684" w:right="672"/>
               <w:jc w:val="center"/>
             </w:pPr>
@@ -1253,9 +1234,6 @@
             </w:tcBorders>
           </w:tcPr>
           <w:p>
-            <w:pPr>
-              <w:spacing w:after="0"/>
-            </w:pPr>
             <w:r>
               <w:rPr>
                 <w:rFonts w:ascii="Arial" w:eastAsia="Arial" w:hAnsi="Arial" w:cs="Arial"/>
@@ -1356,9 +1334,6 @@
             </w:r>
           </w:p>
           <w:p>
-            <w:pPr>
-              <w:spacing w:after="0"/>
-            </w:pPr>
             <w:r>
               <w:rPr>
                 <w:rFonts w:ascii="Arial" w:eastAsia="Arial" w:hAnsi="Arial" w:cs="Arial"/>
@@ -1380,9 +1355,6 @@
             </w:r>
           </w:p>
           <w:p>
-            <w:pPr>
-              <w:spacing w:after="0"/>
-            </w:pPr>
             <w:r>
               <w:rPr>
                 <w:rFonts w:ascii="Arial" w:eastAsia="Arial" w:hAnsi="Arial" w:cs="Arial"/>
@@ -1420,9 +1392,6 @@
             </w:tcBorders>
           </w:tcPr>
           <w:p>
-            <w:pPr>
-              <w:spacing w:after="0"/>
-            </w:pPr>
             <w:r>
               <w:rPr>
                 <w:rFonts w:ascii="Arial" w:eastAsia="Arial" w:hAnsi="Arial" w:cs="Arial"/>
@@ -1517,9 +1486,6 @@
             </w:r>
           </w:p>
           <w:p>
-            <w:pPr>
-              <w:spacing w:after="0"/>
-            </w:pPr>
             <w:r>
               <w:rPr>
                 <w:rFonts w:ascii="Arial" w:eastAsia="Arial" w:hAnsi="Arial" w:cs="Arial"/>
@@ -1541,9 +1507,6 @@
             </w:r>
           </w:p>
           <w:p>
-            <w:pPr>
-              <w:spacing w:after="0"/>
-            </w:pPr>
             <w:r>
               <w:rPr>
                 <w:rFonts w:ascii="Arial" w:eastAsia="Arial" w:hAnsi="Arial" w:cs="Arial"/>
@@ -1581,9 +1544,6 @@
             </w:tcBorders>
           </w:tcPr>
           <w:p>
-            <w:pPr>
-              <w:spacing w:after="0"/>
-            </w:pPr>
             <w:r>
               <w:rPr>
                 <w:rFonts w:ascii="Arial" w:eastAsia="Arial" w:hAnsi="Arial" w:cs="Arial"/>
@@ -1684,9 +1644,6 @@
             </w:r>
           </w:p>
           <w:p>
-            <w:pPr>
-              <w:spacing w:after="0"/>
-            </w:pPr>
             <w:r>
               <w:rPr>
                 <w:rFonts w:ascii="Arial" w:eastAsia="Arial" w:hAnsi="Arial" w:cs="Arial"/>
@@ -1708,9 +1665,6 @@
             </w:r>
           </w:p>
           <w:p>
-            <w:pPr>
-              <w:spacing w:after="0"/>
-            </w:pPr>
             <w:r>
               <w:rPr>
                 <w:rFonts w:ascii="Arial" w:eastAsia="Arial" w:hAnsi="Arial" w:cs="Arial"/>
@@ -1748,9 +1702,6 @@
             </w:tcBorders>
           </w:tcPr>
           <w:p>
-            <w:pPr>
-              <w:spacing w:after="0"/>
-            </w:pPr>
             <w:r>
               <w:rPr>
                 <w:rFonts w:ascii="Arial" w:eastAsia="Arial" w:hAnsi="Arial" w:cs="Arial"/>
@@ -1851,9 +1802,6 @@
             </w:r>
           </w:p>
           <w:p>
-            <w:pPr>
-              <w:spacing w:after="0"/>
-            </w:pPr>
             <w:r>
               <w:rPr>
                 <w:rFonts w:ascii="Arial" w:eastAsia="Arial" w:hAnsi="Arial" w:cs="Arial"/>
@@ -1875,9 +1823,6 @@
             </w:r>
           </w:p>
           <w:p>
-            <w:pPr>
-              <w:spacing w:after="0"/>
-            </w:pPr>
             <w:r>
               <w:rPr>
                 <w:rFonts w:ascii="Arial" w:eastAsia="Arial" w:hAnsi="Arial" w:cs="Arial"/>
@@ -1915,9 +1860,6 @@
             </w:tcBorders>
           </w:tcPr>
           <w:p>
-            <w:pPr>
-              <w:spacing w:after="0"/>
-            </w:pPr>
             <w:r>
               <w:rPr>
                 <w:rFonts w:ascii="Arial" w:eastAsia="Arial" w:hAnsi="Arial" w:cs="Arial"/>
@@ -1951,7 +1893,7 @@
           </w:tcPr>
           <w:p>
             <w:pPr>
-              <w:spacing w:after="0" w:line="240" w:lineRule="auto"/>
+              <w:spacing w:line="240" w:lineRule="auto"/>
               <w:ind w:right="3133"/>
               <w:jc w:val="both"/>
               <w:rPr>
@@ -1999,7 +1941,7 @@
           </w:p>
           <w:p>
             <w:pPr>
-              <w:spacing w:after="0" w:line="240" w:lineRule="auto"/>
+              <w:spacing w:line="240" w:lineRule="auto"/>
               <w:ind w:right="3133"/>
               <w:jc w:val="both"/>
             </w:pPr>
@@ -2019,9 +1961,6 @@
             </w:r>
           </w:p>
           <w:p>
-            <w:pPr>
-              <w:spacing w:after="0"/>
-            </w:pPr>
             <w:r>
               <w:rPr>
                 <w:rFonts w:ascii="Arial" w:eastAsia="Arial" w:hAnsi="Arial" w:cs="Arial"/>
@@ -2043,9 +1982,6 @@
             </w:r>
           </w:p>
           <w:p>
-            <w:pPr>
-              <w:spacing w:after="0"/>
-            </w:pPr>
             <w:r>
               <w:rPr>
                 <w:rFonts w:ascii="Arial" w:eastAsia="Arial" w:hAnsi="Arial" w:cs="Arial"/>
@@ -2083,9 +2019,6 @@
             </w:tcBorders>
           </w:tcPr>
           <w:p>
-            <w:pPr>
-              <w:spacing w:after="0"/>
-            </w:pPr>
             <w:r>
               <w:rPr>
                 <w:rFonts w:ascii="Arial" w:eastAsia="Arial" w:hAnsi="Arial" w:cs="Arial"/>
@@ -2118,7 +2051,7 @@
           </w:tcPr>
           <w:p>
             <w:pPr>
-              <w:spacing w:after="0" w:line="240" w:lineRule="auto"/>
+              <w:spacing w:line="240" w:lineRule="auto"/>
               <w:ind w:right="3133"/>
               <w:jc w:val="both"/>
               <w:rPr>
@@ -2166,7 +2099,7 @@
           </w:p>
           <w:p>
             <w:pPr>
-              <w:spacing w:after="0" w:line="240" w:lineRule="auto"/>
+              <w:spacing w:line="240" w:lineRule="auto"/>
               <w:ind w:right="3133"/>
               <w:jc w:val="both"/>
             </w:pPr>
@@ -2186,9 +2119,6 @@
             </w:r>
           </w:p>
           <w:p>
-            <w:pPr>
-              <w:spacing w:after="0"/>
-            </w:pPr>
             <w:r>
               <w:rPr>
                 <w:rFonts w:ascii="Arial" w:eastAsia="Arial" w:hAnsi="Arial" w:cs="Arial"/>
@@ -2210,9 +2140,6 @@
             </w:r>
           </w:p>
           <w:p>
-            <w:pPr>
-              <w:spacing w:after="0"/>
-            </w:pPr>
             <w:r>
               <w:rPr>
                 <w:rFonts w:ascii="Arial" w:eastAsia="Arial" w:hAnsi="Arial" w:cs="Arial"/>
@@ -2250,9 +2177,6 @@
             </w:tcBorders>
           </w:tcPr>
           <w:p>
-            <w:pPr>
-              <w:spacing w:after="0"/>
-            </w:pPr>
             <w:r>
               <w:rPr>
                 <w:rFonts w:ascii="Arial" w:eastAsia="Arial" w:hAnsi="Arial" w:cs="Arial"/>
@@ -2285,7 +2209,7 @@
           </w:tcPr>
           <w:p>
             <w:pPr>
-              <w:spacing w:after="0" w:line="240" w:lineRule="auto"/>
+              <w:spacing w:line="240" w:lineRule="auto"/>
               <w:ind w:right="3133"/>
               <w:jc w:val="both"/>
               <w:rPr>
@@ -2333,7 +2257,7 @@
           </w:p>
           <w:p>
             <w:pPr>
-              <w:spacing w:after="0" w:line="240" w:lineRule="auto"/>
+              <w:spacing w:line="240" w:lineRule="auto"/>
               <w:ind w:right="3133"/>
               <w:jc w:val="both"/>
             </w:pPr>
@@ -2353,9 +2277,6 @@
             </w:r>
           </w:p>
           <w:p>
-            <w:pPr>
-              <w:spacing w:after="0"/>
-            </w:pPr>
             <w:r>
               <w:rPr>
                 <w:rFonts w:ascii="Arial" w:eastAsia="Arial" w:hAnsi="Arial" w:cs="Arial"/>
@@ -2383,9 +2304,6 @@
             </w:r>
           </w:p>
           <w:p>
-            <w:pPr>
-              <w:spacing w:after="0"/>
-            </w:pPr>
             <w:r>
               <w:rPr>
                 <w:rFonts w:ascii="Arial" w:eastAsia="Arial" w:hAnsi="Arial" w:cs="Arial"/>
@@ -2423,9 +2341,6 @@
             </w:tcBorders>
           </w:tcPr>
           <w:p>
-            <w:pPr>
-              <w:spacing w:after="0"/>
-            </w:pPr>
             <w:r>
               <w:rPr>
                 <w:rFonts w:ascii="Arial" w:eastAsia="Arial" w:hAnsi="Arial" w:cs="Arial"/>
@@ -2464,7 +2379,7 @@
           </w:tcPr>
           <w:p>
             <w:pPr>
-              <w:spacing w:after="0" w:line="240" w:lineRule="auto"/>
+              <w:spacing w:line="240" w:lineRule="auto"/>
               <w:ind w:right="3133"/>
               <w:jc w:val="both"/>
               <w:rPr>
@@ -2512,7 +2427,7 @@
           </w:p>
           <w:p>
             <w:pPr>
-              <w:spacing w:after="0" w:line="240" w:lineRule="auto"/>
+              <w:spacing w:line="240" w:lineRule="auto"/>
               <w:ind w:right="3133"/>
               <w:jc w:val="both"/>
             </w:pPr>
@@ -2546,9 +2461,6 @@
             </w:r>
           </w:p>
           <w:p>
-            <w:pPr>
-              <w:spacing w:after="0"/>
-            </w:pPr>
             <w:r>
               <w:rPr>
                 <w:rFonts w:ascii="Arial" w:eastAsia="Arial" w:hAnsi="Arial" w:cs="Arial"/>
@@ -2570,9 +2482,6 @@
             </w:r>
           </w:p>
           <w:p>
-            <w:pPr>
-              <w:spacing w:after="0"/>
-            </w:pPr>
             <w:r>
               <w:rPr>
                 <w:rFonts w:ascii="Arial" w:eastAsia="Arial" w:hAnsi="Arial" w:cs="Arial"/>
@@ -2610,9 +2519,6 @@
             </w:tcBorders>
           </w:tcPr>
           <w:p>
-            <w:pPr>
-              <w:spacing w:after="0"/>
-            </w:pPr>
             <w:r>
               <w:rPr>
                 <w:rFonts w:ascii="Arial" w:eastAsia="Arial" w:hAnsi="Arial" w:cs="Arial"/>
@@ -2645,7 +2551,7 @@
           </w:tcPr>
           <w:p>
             <w:pPr>
-              <w:spacing w:after="0" w:line="240" w:lineRule="auto"/>
+              <w:spacing w:line="240" w:lineRule="auto"/>
               <w:ind w:right="3133"/>
               <w:jc w:val="both"/>
               <w:rPr>
@@ -2693,7 +2599,7 @@
           </w:p>
           <w:p>
             <w:pPr>
-              <w:spacing w:after="0" w:line="240" w:lineRule="auto"/>
+              <w:spacing w:line="240" w:lineRule="auto"/>
               <w:ind w:right="3133"/>
               <w:jc w:val="both"/>
             </w:pPr>
@@ -2720,9 +2626,6 @@
             </w:r>
           </w:p>
           <w:p>
-            <w:pPr>
-              <w:spacing w:after="0"/>
-            </w:pPr>
             <w:r>
               <w:rPr>
                 <w:rFonts w:ascii="Arial" w:eastAsia="Arial" w:hAnsi="Arial" w:cs="Arial"/>
@@ -2744,9 +2647,6 @@
             </w:r>
           </w:p>
           <w:p>
-            <w:pPr>
-              <w:spacing w:after="0"/>
-            </w:pPr>
             <w:r>
               <w:rPr>
                 <w:rFonts w:ascii="Arial" w:eastAsia="Arial" w:hAnsi="Arial" w:cs="Arial"/>
@@ -2785,7 +2685,6 @@
           </w:tcPr>
           <w:p>
             <w:pPr>
-              <w:spacing w:after="0"/>
               <w:jc w:val="both"/>
             </w:pPr>
             <w:r>
@@ -2820,7 +2719,7 @@
           </w:tcPr>
           <w:p>
             <w:pPr>
-              <w:spacing w:after="0" w:line="240" w:lineRule="auto"/>
+              <w:spacing w:line="240" w:lineRule="auto"/>
               <w:ind w:right="3133"/>
               <w:jc w:val="both"/>
               <w:rPr>
@@ -2868,7 +2767,7 @@
           </w:p>
           <w:p>
             <w:pPr>
-              <w:spacing w:after="0" w:line="240" w:lineRule="auto"/>
+              <w:spacing w:line="240" w:lineRule="auto"/>
               <w:ind w:right="3133"/>
               <w:jc w:val="both"/>
             </w:pPr>
@@ -2888,9 +2787,6 @@
             </w:r>
           </w:p>
           <w:p>
-            <w:pPr>
-              <w:spacing w:after="0"/>
-            </w:pPr>
             <w:r>
               <w:rPr>
                 <w:rFonts w:ascii="Arial" w:eastAsia="Arial" w:hAnsi="Arial" w:cs="Arial"/>
@@ -2913,9 +2809,6 @@
             </w:r>
           </w:p>
           <w:p>
-            <w:pPr>
-              <w:spacing w:after="0"/>
-            </w:pPr>
             <w:r>
               <w:rPr>
                 <w:rFonts w:ascii="Arial" w:eastAsia="Arial" w:hAnsi="Arial" w:cs="Arial"/>
@@ -2955,7 +2848,6 @@
           </w:tcPr>
           <w:p>
             <w:pPr>
-              <w:spacing w:after="0"/>
               <w:ind w:left="3"/>
               <w:jc w:val="center"/>
             </w:pPr>
@@ -2990,7 +2882,6 @@
                 <w:ilvl w:val="0"/>
                 <w:numId w:val="2"/>
               </w:numPr>
-              <w:spacing w:after="0"/>
               <w:ind w:hanging="360"/>
             </w:pPr>
             <w:r>
@@ -3008,7 +2899,6 @@
                 <w:ilvl w:val="0"/>
                 <w:numId w:val="2"/>
               </w:numPr>
-              <w:spacing w:after="0"/>
             </w:pPr>
             <w:r>
               <w:t>Clear top level navigation labels</w:t>
@@ -3021,7 +2911,6 @@
                 <w:ilvl w:val="0"/>
                 <w:numId w:val="2"/>
               </w:numPr>
-              <w:spacing w:after="0"/>
             </w:pPr>
             <w:r>
               <w:t>Short descriptions for each section is simple and helpful to understanding the page</w:t>
@@ -3034,7 +2923,6 @@
                 <w:ilvl w:val="0"/>
                 <w:numId w:val="2"/>
               </w:numPr>
-              <w:spacing w:after="0"/>
             </w:pPr>
             <w:r>
               <w:t>Page navigation is simple and straightforward</w:t>
@@ -3042,7 +2930,6 @@
           </w:p>
           <w:p>
             <w:pPr>
-              <w:spacing w:after="0"/>
               <w:ind w:left="721"/>
             </w:pPr>
           </w:p>
@@ -3053,7 +2940,6 @@
                 <w:ilvl w:val="0"/>
                 <w:numId w:val="7"/>
               </w:numPr>
-              <w:spacing w:after="0"/>
             </w:pPr>
             <w:r>
               <w:t>What they didn’t like</w:t>
@@ -3066,7 +2952,6 @@
                 <w:ilvl w:val="0"/>
                 <w:numId w:val="8"/>
               </w:numPr>
-              <w:spacing w:after="0"/>
             </w:pPr>
             <w:r>
               <w:t>Most of text is the same size so sections blend together instead of guiding the page</w:t>
@@ -3079,7 +2964,6 @@
                 <w:ilvl w:val="0"/>
                 <w:numId w:val="8"/>
               </w:numPr>
-              <w:spacing w:after="0"/>
             </w:pPr>
             <w:r>
               <w:t>Home page felt a little flat and not as engaging</w:t>
@@ -3092,7 +2976,6 @@
                 <w:ilvl w:val="0"/>
                 <w:numId w:val="8"/>
               </w:numPr>
-              <w:spacing w:after="0"/>
             </w:pPr>
             <w:r>
               <w:t>Certain pages the font is t</w:t>
@@ -3108,7 +2991,6 @@
                 <w:ilvl w:val="0"/>
                 <w:numId w:val="8"/>
               </w:numPr>
-              <w:spacing w:after="0"/>
             </w:pPr>
             <w:r>
               <w:t>Wanted more clickable content on pages</w:t>
@@ -3133,7 +3015,6 @@
           </w:tcPr>
           <w:p>
             <w:pPr>
-              <w:spacing w:after="0"/>
               <w:ind w:left="6"/>
               <w:jc w:val="center"/>
             </w:pPr>
@@ -3163,15 +3044,28 @@
             </w:tcBorders>
           </w:tcPr>
           <w:p>
-            <w:pPr>
-              <w:spacing w:after="0"/>
-            </w:pPr>
             <w:r>
               <w:rPr>
                 <w:rFonts w:ascii="Arial" w:eastAsia="Arial" w:hAnsi="Arial" w:cs="Arial"/>
                 <w:i/>
               </w:rPr>
-              <w:t xml:space="preserve">That’s the end of the usability test. Thank you so much for taking the time to participate. Your feedback really helps me understand how users interact with the YourAverageGamer website </w:t>
+              <w:t xml:space="preserve">That’s the end of the usability test. Thank you so much for taking the time to participate. Your feedback really helps me understand how users interact with the </w:t>
+            </w:r>
+            <w:proofErr w:type="spellStart"/>
+            <w:r>
+              <w:rPr>
+                <w:rFonts w:ascii="Arial" w:eastAsia="Arial" w:hAnsi="Arial" w:cs="Arial"/>
+                <w:i/>
+              </w:rPr>
+              <w:t>YourAverageGamer</w:t>
+            </w:r>
+            <w:proofErr w:type="spellEnd"/>
+            <w:r>
+              <w:rPr>
+                <w:rFonts w:ascii="Arial" w:eastAsia="Arial" w:hAnsi="Arial" w:cs="Arial"/>
+                <w:i/>
+              </w:rPr>
+              <w:t xml:space="preserve"> website </w:t>
             </w:r>
             <w:r>
               <w:rPr>
@@ -3215,7 +3109,6 @@
           </w:tcPr>
           <w:p>
             <w:pPr>
-              <w:spacing w:after="0"/>
               <w:ind w:left="7"/>
               <w:jc w:val="center"/>
             </w:pPr>
@@ -3246,22 +3139,12 @@
             </w:tcBorders>
           </w:tcPr>
           <w:p>
-            <w:pPr>
-              <w:spacing w:after="0"/>
-            </w:pPr>
             <w:r>
               <w:rPr>
                 <w:rFonts w:ascii="Arial" w:eastAsia="Arial" w:hAnsi="Arial" w:cs="Arial"/>
                 <w:i/>
               </w:rPr>
-              <w:t>The assessment went smoothly. I wouldn’t do anything differently next time I felt like I got the process of the assessment down.</w:t>
-            </w:r>
-            <w:r>
-              <w:rPr>
-                <w:rFonts w:ascii="Arial" w:eastAsia="Arial" w:hAnsi="Arial" w:cs="Arial"/>
-                <w:i/>
-              </w:rPr>
-              <w:t xml:space="preserve"> </w:t>
+              <w:t xml:space="preserve">The assessment went smoothly. I wouldn’t do anything differently next time I felt like I got the process of the assessment down. </w:t>
             </w:r>
           </w:p>
         </w:tc>
@@ -3288,7 +3171,6 @@
         <w:tblCellMar>
           <w:top w:w="50" w:type="dxa"/>
           <w:left w:w="105" w:type="dxa"/>
-          <w:bottom w:w="0" w:type="dxa"/>
           <w:right w:w="57" w:type="dxa"/>
         </w:tblCellMar>
         <w:tblLook w:val="04A0" w:firstRow="1" w:lastRow="0" w:firstColumn="1" w:lastColumn="0" w:noHBand="0" w:noVBand="1"/>
@@ -3313,7 +3195,6 @@
           </w:tcPr>
           <w:p>
             <w:pPr>
-              <w:spacing w:after="0"/>
               <w:ind w:left="5"/>
             </w:pPr>
             <w:r>
@@ -3336,9 +3217,6 @@
             </w:tcBorders>
           </w:tcPr>
           <w:p>
-            <w:pPr>
-              <w:spacing w:after="0"/>
-            </w:pPr>
             <w:r>
               <w:rPr>
                 <w:rFonts w:ascii="Arial" w:eastAsia="Arial" w:hAnsi="Arial" w:cs="Arial"/>
@@ -3365,7 +3243,6 @@
           </w:tcPr>
           <w:p>
             <w:pPr>
-              <w:spacing w:after="0"/>
               <w:ind w:left="5"/>
             </w:pPr>
             <w:r>
@@ -3388,9 +3265,6 @@
             </w:tcBorders>
           </w:tcPr>
           <w:p>
-            <w:pPr>
-              <w:spacing w:after="0"/>
-            </w:pPr>
             <w:r>
               <w:rPr>
                 <w:rFonts w:ascii="Arial" w:eastAsia="Arial" w:hAnsi="Arial" w:cs="Arial"/>
@@ -3417,7 +3291,6 @@
           </w:tcPr>
           <w:p>
             <w:pPr>
-              <w:spacing w:after="0"/>
               <w:ind w:left="5"/>
             </w:pPr>
             <w:r>
@@ -3440,9 +3313,6 @@
             </w:tcBorders>
           </w:tcPr>
           <w:p>
-            <w:pPr>
-              <w:spacing w:after="0"/>
-            </w:pPr>
             <w:r>
               <w:rPr>
                 <w:rFonts w:ascii="Arial" w:eastAsia="Arial" w:hAnsi="Arial" w:cs="Arial"/>
@@ -3469,7 +3339,6 @@
           </w:tcPr>
           <w:p>
             <w:pPr>
-              <w:spacing w:after="0"/>
               <w:ind w:left="5"/>
             </w:pPr>
             <w:r>
@@ -3492,9 +3361,6 @@
             </w:tcBorders>
           </w:tcPr>
           <w:p>
-            <w:pPr>
-              <w:spacing w:after="0"/>
-            </w:pPr>
             <w:r>
               <w:rPr>
                 <w:rFonts w:ascii="Arial" w:eastAsia="Arial" w:hAnsi="Arial" w:cs="Arial"/>
@@ -3521,7 +3387,6 @@
           </w:tcPr>
           <w:p>
             <w:pPr>
-              <w:spacing w:after="0"/>
               <w:ind w:left="5"/>
             </w:pPr>
             <w:r>
@@ -3544,9 +3409,6 @@
             </w:tcBorders>
           </w:tcPr>
           <w:p>
-            <w:pPr>
-              <w:spacing w:after="0"/>
-            </w:pPr>
             <w:r>
               <w:rPr>
                 <w:rFonts w:ascii="Arial" w:eastAsia="Arial" w:hAnsi="Arial" w:cs="Arial"/>
@@ -3573,7 +3435,6 @@
           </w:tcPr>
           <w:p>
             <w:pPr>
-              <w:spacing w:after="0"/>
               <w:ind w:left="5"/>
             </w:pPr>
             <w:r>
@@ -3596,9 +3457,6 @@
             </w:tcBorders>
           </w:tcPr>
           <w:p>
-            <w:pPr>
-              <w:spacing w:after="0"/>
-            </w:pPr>
             <w:r>
               <w:rPr>
                 <w:rFonts w:ascii="Arial" w:eastAsia="Arial" w:hAnsi="Arial" w:cs="Arial"/>
@@ -3626,7 +3484,6 @@
           </w:tcPr>
           <w:p>
             <w:pPr>
-              <w:spacing w:after="0"/>
               <w:ind w:right="43"/>
               <w:jc w:val="center"/>
             </w:pPr>
@@ -3697,12 +3554,14 @@
               </w:rPr>
               <w:t xml:space="preserve">Your formal introduction </w:t>
             </w:r>
+            <w:proofErr w:type="spellStart"/>
             <w:r>
               <w:rPr>
                 <w:rFonts w:ascii="Courier New" w:eastAsia="Courier New" w:hAnsi="Courier New" w:cs="Courier New"/>
               </w:rPr>
               <w:t>o</w:t>
             </w:r>
+            <w:proofErr w:type="spellEnd"/>
             <w:r>
               <w:rPr>
                 <w:rFonts w:ascii="Arial" w:eastAsia="Arial" w:hAnsi="Arial" w:cs="Arial"/>
@@ -3716,12 +3575,14 @@
               </w:rPr>
               <w:t xml:space="preserve">Your name </w:t>
             </w:r>
+            <w:proofErr w:type="spellStart"/>
             <w:r>
               <w:rPr>
                 <w:rFonts w:ascii="Courier New" w:eastAsia="Courier New" w:hAnsi="Courier New" w:cs="Courier New"/>
               </w:rPr>
               <w:t>o</w:t>
             </w:r>
+            <w:proofErr w:type="spellEnd"/>
             <w:r>
               <w:rPr>
                 <w:rFonts w:ascii="Arial" w:eastAsia="Arial" w:hAnsi="Arial" w:cs="Arial"/>
@@ -3761,7 +3622,6 @@
                 <w:ilvl w:val="0"/>
                 <w:numId w:val="3"/>
               </w:numPr>
-              <w:spacing w:after="0"/>
               <w:ind w:hanging="360"/>
             </w:pPr>
             <w:r>
@@ -3882,7 +3742,6 @@
                 <w:ilvl w:val="0"/>
                 <w:numId w:val="3"/>
               </w:numPr>
-              <w:spacing w:after="0"/>
               <w:ind w:hanging="360"/>
             </w:pPr>
             <w:r>
@@ -3912,7 +3771,6 @@
           </w:tcPr>
           <w:p>
             <w:pPr>
-              <w:spacing w:after="0"/>
               <w:ind w:right="48"/>
               <w:jc w:val="center"/>
             </w:pPr>
@@ -3926,7 +3784,6 @@
           </w:p>
           <w:p>
             <w:pPr>
-              <w:spacing w:after="0"/>
               <w:ind w:left="684" w:right="666"/>
               <w:jc w:val="center"/>
             </w:pPr>
@@ -3955,7 +3812,6 @@
           </w:tcPr>
           <w:p>
             <w:pPr>
-              <w:spacing w:after="0"/>
               <w:ind w:left="5"/>
             </w:pPr>
             <w:r>
@@ -3978,7 +3834,7 @@
           </w:tcPr>
           <w:p>
             <w:pPr>
-              <w:spacing w:after="0" w:line="242" w:lineRule="auto"/>
+              <w:spacing w:line="242" w:lineRule="auto"/>
               <w:ind w:right="3127"/>
               <w:jc w:val="both"/>
             </w:pPr>
@@ -4017,9 +3873,6 @@
             </w:r>
           </w:p>
           <w:p>
-            <w:pPr>
-              <w:spacing w:after="0"/>
-            </w:pPr>
             <w:r>
               <w:rPr>
                 <w:rFonts w:ascii="Arial" w:eastAsia="Arial" w:hAnsi="Arial" w:cs="Arial"/>
@@ -4035,9 +3888,6 @@
             </w:r>
           </w:p>
           <w:p>
-            <w:pPr>
-              <w:spacing w:after="0"/>
-            </w:pPr>
             <w:r>
               <w:rPr>
                 <w:rFonts w:ascii="Arial" w:eastAsia="Arial" w:hAnsi="Arial" w:cs="Arial"/>
@@ -4070,7 +3920,6 @@
           </w:tcPr>
           <w:p>
             <w:pPr>
-              <w:spacing w:after="0"/>
               <w:ind w:left="5"/>
             </w:pPr>
             <w:r>
@@ -4093,7 +3942,6 @@
           </w:tcPr>
           <w:p>
             <w:pPr>
-              <w:spacing w:after="0"/>
               <w:ind w:right="2550"/>
               <w:jc w:val="both"/>
             </w:pPr>
@@ -4141,15 +3989,14 @@
         <w:tblCellMar>
           <w:top w:w="50" w:type="dxa"/>
           <w:left w:w="11" w:type="dxa"/>
-          <w:bottom w:w="0" w:type="dxa"/>
           <w:right w:w="57" w:type="dxa"/>
         </w:tblCellMar>
         <w:tblLook w:val="04A0" w:firstRow="1" w:lastRow="0" w:firstColumn="1" w:lastColumn="0" w:noHBand="0" w:noVBand="1"/>
       </w:tblPr>
       <w:tblGrid>
-        <w:gridCol w:w="6"/>
-        <w:gridCol w:w="2698"/>
-        <w:gridCol w:w="6644"/>
+        <w:gridCol w:w="7"/>
+        <w:gridCol w:w="2502"/>
+        <w:gridCol w:w="7184"/>
         <w:gridCol w:w="6"/>
       </w:tblGrid>
       <w:tr>
@@ -4182,9 +4029,6 @@
             </w:tcBorders>
           </w:tcPr>
           <w:p>
-            <w:pPr>
-              <w:spacing w:after="0"/>
-            </w:pPr>
             <w:r>
               <w:rPr>
                 <w:rFonts w:ascii="Arial" w:eastAsia="Arial" w:hAnsi="Arial" w:cs="Arial"/>
@@ -4194,9 +4038,6 @@
             </w:r>
           </w:p>
           <w:p>
-            <w:pPr>
-              <w:spacing w:after="0"/>
-            </w:pPr>
             <w:r>
               <w:rPr>
                 <w:rFonts w:ascii="Arial" w:eastAsia="Arial" w:hAnsi="Arial" w:cs="Arial"/>
@@ -4212,9 +4053,6 @@
             </w:r>
           </w:p>
           <w:p>
-            <w:pPr>
-              <w:spacing w:after="0"/>
-            </w:pPr>
             <w:r>
               <w:rPr>
                 <w:rFonts w:ascii="Arial" w:eastAsia="Arial" w:hAnsi="Arial" w:cs="Arial"/>
@@ -4249,7 +4087,6 @@
           </w:tcPr>
           <w:p>
             <w:pPr>
-              <w:spacing w:after="0"/>
               <w:ind w:left="5"/>
             </w:pPr>
             <w:r>
@@ -4312,9 +4149,6 @@
             </w:r>
           </w:p>
           <w:p>
-            <w:pPr>
-              <w:spacing w:after="0"/>
-            </w:pPr>
             <w:r>
               <w:rPr>
                 <w:rFonts w:ascii="Arial" w:eastAsia="Arial" w:hAnsi="Arial" w:cs="Arial"/>
@@ -4330,9 +4164,6 @@
             </w:r>
           </w:p>
           <w:p>
-            <w:pPr>
-              <w:spacing w:after="0"/>
-            </w:pPr>
             <w:r>
               <w:rPr>
                 <w:rFonts w:ascii="Arial" w:eastAsia="Arial" w:hAnsi="Arial" w:cs="Arial"/>
@@ -4367,7 +4198,6 @@
           </w:tcPr>
           <w:p>
             <w:pPr>
-              <w:spacing w:after="0"/>
               <w:ind w:left="5"/>
             </w:pPr>
             <w:r>
@@ -4430,9 +4260,6 @@
             </w:r>
           </w:p>
           <w:p>
-            <w:pPr>
-              <w:spacing w:after="0"/>
-            </w:pPr>
             <w:r>
               <w:rPr>
                 <w:rFonts w:ascii="Arial" w:eastAsia="Arial" w:hAnsi="Arial" w:cs="Arial"/>
@@ -4448,9 +4275,6 @@
             </w:r>
           </w:p>
           <w:p>
-            <w:pPr>
-              <w:spacing w:after="0"/>
-            </w:pPr>
             <w:r>
               <w:rPr>
                 <w:rFonts w:ascii="Arial" w:eastAsia="Arial" w:hAnsi="Arial" w:cs="Arial"/>
@@ -4485,7 +4309,6 @@
           </w:tcPr>
           <w:p>
             <w:pPr>
-              <w:spacing w:after="0"/>
               <w:ind w:left="5"/>
             </w:pPr>
             <w:r>
@@ -4548,9 +4371,6 @@
             </w:r>
           </w:p>
           <w:p>
-            <w:pPr>
-              <w:spacing w:after="0"/>
-            </w:pPr>
             <w:r>
               <w:rPr>
                 <w:rFonts w:ascii="Arial" w:eastAsia="Arial" w:hAnsi="Arial" w:cs="Arial"/>
@@ -4566,9 +4386,6 @@
             </w:r>
           </w:p>
           <w:p>
-            <w:pPr>
-              <w:spacing w:after="0"/>
-            </w:pPr>
             <w:r>
               <w:rPr>
                 <w:rFonts w:ascii="Arial" w:eastAsia="Arial" w:hAnsi="Arial" w:cs="Arial"/>
@@ -4603,7 +4420,6 @@
           </w:tcPr>
           <w:p>
             <w:pPr>
-              <w:spacing w:after="0"/>
               <w:ind w:left="5"/>
             </w:pPr>
             <w:r>
@@ -4666,9 +4482,6 @@
             </w:r>
           </w:p>
           <w:p>
-            <w:pPr>
-              <w:spacing w:after="0"/>
-            </w:pPr>
             <w:r>
               <w:rPr>
                 <w:rFonts w:ascii="Arial" w:eastAsia="Arial" w:hAnsi="Arial" w:cs="Arial"/>
@@ -4684,9 +4497,6 @@
             </w:r>
           </w:p>
           <w:p>
-            <w:pPr>
-              <w:spacing w:after="0"/>
-            </w:pPr>
             <w:r>
               <w:rPr>
                 <w:rFonts w:ascii="Arial" w:eastAsia="Arial" w:hAnsi="Arial" w:cs="Arial"/>
@@ -4721,7 +4531,6 @@
           </w:tcPr>
           <w:p>
             <w:pPr>
-              <w:spacing w:after="0"/>
               <w:ind w:left="5"/>
             </w:pPr>
             <w:r>
@@ -4745,7 +4554,7 @@
           </w:tcPr>
           <w:p>
             <w:pPr>
-              <w:spacing w:after="0" w:line="240" w:lineRule="auto"/>
+              <w:spacing w:line="240" w:lineRule="auto"/>
               <w:ind w:right="3127"/>
               <w:jc w:val="both"/>
             </w:pPr>
@@ -4784,9 +4593,6 @@
             </w:r>
           </w:p>
           <w:p>
-            <w:pPr>
-              <w:spacing w:after="0"/>
-            </w:pPr>
             <w:r>
               <w:rPr>
                 <w:rFonts w:ascii="Arial" w:eastAsia="Arial" w:hAnsi="Arial" w:cs="Arial"/>
@@ -4802,9 +4608,6 @@
             </w:r>
           </w:p>
           <w:p>
-            <w:pPr>
-              <w:spacing w:after="0"/>
-            </w:pPr>
             <w:r>
               <w:rPr>
                 <w:rFonts w:ascii="Arial" w:eastAsia="Arial" w:hAnsi="Arial" w:cs="Arial"/>
@@ -4839,7 +4642,6 @@
           </w:tcPr>
           <w:p>
             <w:pPr>
-              <w:spacing w:after="0"/>
               <w:ind w:left="5"/>
             </w:pPr>
             <w:r>
@@ -4863,7 +4665,7 @@
           </w:tcPr>
           <w:p>
             <w:pPr>
-              <w:spacing w:after="0" w:line="240" w:lineRule="auto"/>
+              <w:spacing w:line="240" w:lineRule="auto"/>
               <w:ind w:right="3127"/>
               <w:jc w:val="both"/>
             </w:pPr>
@@ -4902,9 +4704,6 @@
             </w:r>
           </w:p>
           <w:p>
-            <w:pPr>
-              <w:spacing w:after="0"/>
-            </w:pPr>
             <w:r>
               <w:rPr>
                 <w:rFonts w:ascii="Arial" w:eastAsia="Arial" w:hAnsi="Arial" w:cs="Arial"/>
@@ -4920,9 +4719,6 @@
             </w:r>
           </w:p>
           <w:p>
-            <w:pPr>
-              <w:spacing w:after="0"/>
-            </w:pPr>
             <w:r>
               <w:rPr>
                 <w:rFonts w:ascii="Arial" w:eastAsia="Arial" w:hAnsi="Arial" w:cs="Arial"/>
@@ -4957,7 +4753,6 @@
           </w:tcPr>
           <w:p>
             <w:pPr>
-              <w:spacing w:after="0"/>
               <w:ind w:left="5"/>
             </w:pPr>
             <w:r>
@@ -4981,7 +4776,7 @@
           </w:tcPr>
           <w:p>
             <w:pPr>
-              <w:spacing w:after="0" w:line="240" w:lineRule="auto"/>
+              <w:spacing w:line="240" w:lineRule="auto"/>
               <w:ind w:right="3127"/>
               <w:jc w:val="both"/>
             </w:pPr>
@@ -5020,9 +4815,6 @@
             </w:r>
           </w:p>
           <w:p>
-            <w:pPr>
-              <w:spacing w:after="0"/>
-            </w:pPr>
             <w:r>
               <w:rPr>
                 <w:rFonts w:ascii="Arial" w:eastAsia="Arial" w:hAnsi="Arial" w:cs="Arial"/>
@@ -5038,9 +4830,6 @@
             </w:r>
           </w:p>
           <w:p>
-            <w:pPr>
-              <w:spacing w:after="0"/>
-            </w:pPr>
             <w:r>
               <w:rPr>
                 <w:rFonts w:ascii="Arial" w:eastAsia="Arial" w:hAnsi="Arial" w:cs="Arial"/>
@@ -5075,7 +4864,6 @@
           </w:tcPr>
           <w:p>
             <w:pPr>
-              <w:spacing w:after="0"/>
               <w:ind w:left="5"/>
               <w:jc w:val="both"/>
             </w:pPr>
@@ -5100,7 +4888,7 @@
           </w:tcPr>
           <w:p>
             <w:pPr>
-              <w:spacing w:after="0" w:line="240" w:lineRule="auto"/>
+              <w:spacing w:line="240" w:lineRule="auto"/>
               <w:ind w:right="3127"/>
               <w:jc w:val="both"/>
             </w:pPr>
@@ -5139,9 +4927,6 @@
             </w:r>
           </w:p>
           <w:p>
-            <w:pPr>
-              <w:spacing w:after="0"/>
-            </w:pPr>
             <w:r>
               <w:rPr>
                 <w:rFonts w:ascii="Arial" w:eastAsia="Arial" w:hAnsi="Arial" w:cs="Arial"/>
@@ -5157,9 +4942,6 @@
             </w:r>
           </w:p>
           <w:p>
-            <w:pPr>
-              <w:spacing w:after="0"/>
-            </w:pPr>
             <w:r>
               <w:rPr>
                 <w:rFonts w:ascii="Arial" w:eastAsia="Arial" w:hAnsi="Arial" w:cs="Arial"/>
@@ -5195,7 +4977,6 @@
           </w:tcPr>
           <w:p>
             <w:pPr>
-              <w:spacing w:after="0"/>
               <w:ind w:right="51"/>
               <w:jc w:val="center"/>
             </w:pPr>
@@ -5228,7 +5009,6 @@
           </w:tcPr>
           <w:p>
             <w:pPr>
-              <w:spacing w:after="0"/>
               <w:ind w:left="5"/>
             </w:pPr>
             <w:r>
@@ -5284,7 +5064,6 @@
                 <w:ilvl w:val="0"/>
                 <w:numId w:val="4"/>
               </w:numPr>
-              <w:spacing w:after="0"/>
               <w:ind w:hanging="360"/>
             </w:pPr>
             <w:r>
@@ -5301,7 +5080,6 @@
                 <w:ilvl w:val="0"/>
                 <w:numId w:val="4"/>
               </w:numPr>
-              <w:spacing w:after="0"/>
               <w:ind w:hanging="360"/>
             </w:pPr>
             <w:r>
@@ -5333,7 +5111,6 @@
           </w:tcPr>
           <w:p>
             <w:pPr>
-              <w:spacing w:after="0"/>
               <w:ind w:right="50"/>
               <w:jc w:val="center"/>
             </w:pPr>
@@ -5366,7 +5143,6 @@
           </w:tcPr>
           <w:p>
             <w:pPr>
-              <w:spacing w:after="0"/>
               <w:ind w:left="5"/>
             </w:pPr>
             <w:r>
@@ -5398,7 +5174,6 @@
           </w:tcPr>
           <w:p>
             <w:pPr>
-              <w:spacing w:after="0"/>
               <w:ind w:left="49"/>
               <w:jc w:val="center"/>
             </w:pPr>
@@ -5431,7 +5206,6 @@
           </w:tcPr>
           <w:p>
             <w:pPr>
-              <w:spacing w:after="0"/>
               <w:ind w:left="115"/>
             </w:pPr>
             <w:r>
@@ -5476,9 +5250,6 @@
             </w:r>
           </w:p>
           <w:p>
-            <w:pPr>
-              <w:spacing w:after="0"/>
-            </w:pPr>
             <w:r>
               <w:rPr>
                 <w:b/>
@@ -5509,7 +5280,6 @@
           </w:tcPr>
           <w:p>
             <w:pPr>
-              <w:spacing w:after="0"/>
               <w:ind w:left="115"/>
             </w:pPr>
             <w:r>
@@ -5518,7 +5288,7 @@
                 <w:color w:val="1D2125"/>
                 <w:sz w:val="24"/>
               </w:rPr>
-              <w:t xml:space="preserve">Member 1 Name </w:t>
+              <w:t>Jermaine Jackson</w:t>
             </w:r>
           </w:p>
         </w:tc>
@@ -5542,16 +5312,326 @@
           </w:tcPr>
           <w:p>
             <w:pPr>
-              <w:spacing w:after="0"/>
               <w:ind w:left="115"/>
-            </w:pPr>
-            <w:r>
               <w:rPr>
                 <w:i/>
                 <w:color w:val="1D2125"/>
                 <w:sz w:val="24"/>
               </w:rPr>
-              <w:t xml:space="preserve">Insert the Accessibility test screenshots here </w:t>
+            </w:pPr>
+            <w:r>
+              <w:rPr>
+                <w:i/>
+                <w:noProof/>
+                <w:color w:val="1D2125"/>
+                <w:sz w:val="24"/>
+              </w:rPr>
+              <w:drawing>
+                <wp:inline distT="0" distB="0" distL="0" distR="0" wp14:anchorId="4182A58F" wp14:editId="2EC3C12B">
+                  <wp:extent cx="5495925" cy="1936750"/>
+                  <wp:effectExtent l="0" t="0" r="9525" b="6350"/>
+                  <wp:docPr id="857058818" name="Picture 1"/>
+                  <wp:cNvGraphicFramePr>
+                    <a:graphicFrameLocks xmlns:a="http://schemas.openxmlformats.org/drawingml/2006/main" noChangeAspect="1"/>
+                  </wp:cNvGraphicFramePr>
+                  <a:graphic xmlns:a="http://schemas.openxmlformats.org/drawingml/2006/main">
+                    <a:graphicData uri="http://schemas.openxmlformats.org/drawingml/2006/picture">
+                      <pic:pic xmlns:pic="http://schemas.openxmlformats.org/drawingml/2006/picture">
+                        <pic:nvPicPr>
+                          <pic:cNvPr id="857058818" name="Picture 857058818"/>
+                          <pic:cNvPicPr/>
+                        </pic:nvPicPr>
+                        <pic:blipFill>
+                          <a:blip r:embed="rId6" cstate="print">
+                            <a:extLst>
+                              <a:ext uri="{28A0092B-C50C-407E-A947-70E740481C1C}">
+                                <a14:useLocalDpi xmlns:a14="http://schemas.microsoft.com/office/drawing/2010/main" val="0"/>
+                              </a:ext>
+                            </a:extLst>
+                          </a:blip>
+                          <a:stretch>
+                            <a:fillRect/>
+                          </a:stretch>
+                        </pic:blipFill>
+                        <pic:spPr>
+                          <a:xfrm>
+                            <a:off x="0" y="0"/>
+                            <a:ext cx="5495925" cy="1936750"/>
+                          </a:xfrm>
+                          <a:prstGeom prst="rect">
+                            <a:avLst/>
+                          </a:prstGeom>
+                        </pic:spPr>
+                      </pic:pic>
+                    </a:graphicData>
+                  </a:graphic>
+                </wp:inline>
+              </w:drawing>
+            </w:r>
+            <w:r>
+              <w:rPr>
+                <w:i/>
+                <w:color w:val="1D2125"/>
+                <w:sz w:val="24"/>
+              </w:rPr>
+              <w:t xml:space="preserve"> </w:t>
+            </w:r>
+          </w:p>
+          <w:p>
+            <w:pPr>
+              <w:ind w:left="115"/>
+            </w:pPr>
+            <w:r>
+              <w:rPr>
+                <w:noProof/>
+              </w:rPr>
+              <w:drawing>
+                <wp:inline distT="0" distB="0" distL="0" distR="0" wp14:anchorId="0AC49B77" wp14:editId="0BC8BB3D">
+                  <wp:extent cx="6039333" cy="3190875"/>
+                  <wp:effectExtent l="0" t="0" r="0" b="0"/>
+                  <wp:docPr id="1672517029" name="Picture 2"/>
+                  <wp:cNvGraphicFramePr>
+                    <a:graphicFrameLocks xmlns:a="http://schemas.openxmlformats.org/drawingml/2006/main" noChangeAspect="1"/>
+                  </wp:cNvGraphicFramePr>
+                  <a:graphic xmlns:a="http://schemas.openxmlformats.org/drawingml/2006/main">
+                    <a:graphicData uri="http://schemas.openxmlformats.org/drawingml/2006/picture">
+                      <pic:pic xmlns:pic="http://schemas.openxmlformats.org/drawingml/2006/picture">
+                        <pic:nvPicPr>
+                          <pic:cNvPr id="1672517029" name="Picture 1672517029"/>
+                          <pic:cNvPicPr/>
+                        </pic:nvPicPr>
+                        <pic:blipFill>
+                          <a:blip r:embed="rId7" cstate="print">
+                            <a:extLst>
+                              <a:ext uri="{28A0092B-C50C-407E-A947-70E740481C1C}">
+                                <a14:useLocalDpi xmlns:a14="http://schemas.microsoft.com/office/drawing/2010/main" val="0"/>
+                              </a:ext>
+                            </a:extLst>
+                          </a:blip>
+                          <a:stretch>
+                            <a:fillRect/>
+                          </a:stretch>
+                        </pic:blipFill>
+                        <pic:spPr>
+                          <a:xfrm>
+                            <a:off x="0" y="0"/>
+                            <a:ext cx="6055630" cy="3199486"/>
+                          </a:xfrm>
+                          <a:prstGeom prst="rect">
+                            <a:avLst/>
+                          </a:prstGeom>
+                        </pic:spPr>
+                      </pic:pic>
+                    </a:graphicData>
+                  </a:graphic>
+                </wp:inline>
+              </w:drawing>
+            </w:r>
+          </w:p>
+          <w:p>
+            <w:pPr>
+              <w:ind w:left="115"/>
+            </w:pPr>
+            <w:r>
+              <w:rPr>
+                <w:noProof/>
+              </w:rPr>
+              <w:lastRenderedPageBreak/>
+              <w:drawing>
+                <wp:inline distT="0" distB="0" distL="0" distR="0" wp14:anchorId="6FD0D8DF" wp14:editId="600DC844">
+                  <wp:extent cx="5943600" cy="3150235"/>
+                  <wp:effectExtent l="0" t="0" r="0" b="0"/>
+                  <wp:docPr id="989579326" name="Picture 3"/>
+                  <wp:cNvGraphicFramePr>
+                    <a:graphicFrameLocks xmlns:a="http://schemas.openxmlformats.org/drawingml/2006/main" noChangeAspect="1"/>
+                  </wp:cNvGraphicFramePr>
+                  <a:graphic xmlns:a="http://schemas.openxmlformats.org/drawingml/2006/main">
+                    <a:graphicData uri="http://schemas.openxmlformats.org/drawingml/2006/picture">
+                      <pic:pic xmlns:pic="http://schemas.openxmlformats.org/drawingml/2006/picture">
+                        <pic:nvPicPr>
+                          <pic:cNvPr id="989579326" name="Picture 989579326"/>
+                          <pic:cNvPicPr/>
+                        </pic:nvPicPr>
+                        <pic:blipFill>
+                          <a:blip r:embed="rId8" cstate="print">
+                            <a:extLst>
+                              <a:ext uri="{28A0092B-C50C-407E-A947-70E740481C1C}">
+                                <a14:useLocalDpi xmlns:a14="http://schemas.microsoft.com/office/drawing/2010/main" val="0"/>
+                              </a:ext>
+                            </a:extLst>
+                          </a:blip>
+                          <a:stretch>
+                            <a:fillRect/>
+                          </a:stretch>
+                        </pic:blipFill>
+                        <pic:spPr>
+                          <a:xfrm>
+                            <a:off x="0" y="0"/>
+                            <a:ext cx="5943600" cy="3150235"/>
+                          </a:xfrm>
+                          <a:prstGeom prst="rect">
+                            <a:avLst/>
+                          </a:prstGeom>
+                        </pic:spPr>
+                      </pic:pic>
+                    </a:graphicData>
+                  </a:graphic>
+                </wp:inline>
+              </w:drawing>
+            </w:r>
+          </w:p>
+          <w:p>
+            <w:pPr>
+              <w:ind w:left="115"/>
+            </w:pPr>
+            <w:r>
+              <w:rPr>
+                <w:noProof/>
+              </w:rPr>
+              <w:drawing>
+                <wp:inline distT="0" distB="0" distL="0" distR="0" wp14:anchorId="02B4BA54" wp14:editId="7D271998">
+                  <wp:extent cx="5943600" cy="3111500"/>
+                  <wp:effectExtent l="0" t="0" r="0" b="0"/>
+                  <wp:docPr id="932848983" name="Picture 4"/>
+                  <wp:cNvGraphicFramePr>
+                    <a:graphicFrameLocks xmlns:a="http://schemas.openxmlformats.org/drawingml/2006/main" noChangeAspect="1"/>
+                  </wp:cNvGraphicFramePr>
+                  <a:graphic xmlns:a="http://schemas.openxmlformats.org/drawingml/2006/main">
+                    <a:graphicData uri="http://schemas.openxmlformats.org/drawingml/2006/picture">
+                      <pic:pic xmlns:pic="http://schemas.openxmlformats.org/drawingml/2006/picture">
+                        <pic:nvPicPr>
+                          <pic:cNvPr id="932848983" name="Picture 932848983"/>
+                          <pic:cNvPicPr/>
+                        </pic:nvPicPr>
+                        <pic:blipFill>
+                          <a:blip r:embed="rId9" cstate="print">
+                            <a:extLst>
+                              <a:ext uri="{28A0092B-C50C-407E-A947-70E740481C1C}">
+                                <a14:useLocalDpi xmlns:a14="http://schemas.microsoft.com/office/drawing/2010/main" val="0"/>
+                              </a:ext>
+                            </a:extLst>
+                          </a:blip>
+                          <a:stretch>
+                            <a:fillRect/>
+                          </a:stretch>
+                        </pic:blipFill>
+                        <pic:spPr>
+                          <a:xfrm>
+                            <a:off x="0" y="0"/>
+                            <a:ext cx="5943600" cy="3111500"/>
+                          </a:xfrm>
+                          <a:prstGeom prst="rect">
+                            <a:avLst/>
+                          </a:prstGeom>
+                        </pic:spPr>
+                      </pic:pic>
+                    </a:graphicData>
+                  </a:graphic>
+                </wp:inline>
+              </w:drawing>
+            </w:r>
+          </w:p>
+          <w:p>
+            <w:pPr>
+              <w:ind w:left="115"/>
+            </w:pPr>
+            <w:r>
+              <w:rPr>
+                <w:noProof/>
+              </w:rPr>
+              <w:lastRenderedPageBreak/>
+              <w:drawing>
+                <wp:inline distT="0" distB="0" distL="0" distR="0" wp14:anchorId="21F79C43" wp14:editId="0174E94F">
+                  <wp:extent cx="5943600" cy="3223895"/>
+                  <wp:effectExtent l="0" t="0" r="0" b="0"/>
+                  <wp:docPr id="1358824962" name="Picture 5"/>
+                  <wp:cNvGraphicFramePr>
+                    <a:graphicFrameLocks xmlns:a="http://schemas.openxmlformats.org/drawingml/2006/main" noChangeAspect="1"/>
+                  </wp:cNvGraphicFramePr>
+                  <a:graphic xmlns:a="http://schemas.openxmlformats.org/drawingml/2006/main">
+                    <a:graphicData uri="http://schemas.openxmlformats.org/drawingml/2006/picture">
+                      <pic:pic xmlns:pic="http://schemas.openxmlformats.org/drawingml/2006/picture">
+                        <pic:nvPicPr>
+                          <pic:cNvPr id="1358824962" name="Picture 1358824962"/>
+                          <pic:cNvPicPr/>
+                        </pic:nvPicPr>
+                        <pic:blipFill>
+                          <a:blip r:embed="rId10" cstate="print">
+                            <a:extLst>
+                              <a:ext uri="{28A0092B-C50C-407E-A947-70E740481C1C}">
+                                <a14:useLocalDpi xmlns:a14="http://schemas.microsoft.com/office/drawing/2010/main" val="0"/>
+                              </a:ext>
+                            </a:extLst>
+                          </a:blip>
+                          <a:stretch>
+                            <a:fillRect/>
+                          </a:stretch>
+                        </pic:blipFill>
+                        <pic:spPr>
+                          <a:xfrm>
+                            <a:off x="0" y="0"/>
+                            <a:ext cx="5943600" cy="3223895"/>
+                          </a:xfrm>
+                          <a:prstGeom prst="rect">
+                            <a:avLst/>
+                          </a:prstGeom>
+                        </pic:spPr>
+                      </pic:pic>
+                    </a:graphicData>
+                  </a:graphic>
+                </wp:inline>
+              </w:drawing>
+            </w:r>
+          </w:p>
+          <w:p>
+            <w:pPr>
+              <w:ind w:left="115"/>
+            </w:pPr>
+            <w:r>
+              <w:rPr>
+                <w:noProof/>
+              </w:rPr>
+              <w:drawing>
+                <wp:inline distT="0" distB="0" distL="0" distR="0" wp14:anchorId="35E27A90" wp14:editId="6D3410C9">
+                  <wp:extent cx="5943600" cy="2912110"/>
+                  <wp:effectExtent l="0" t="0" r="0" b="2540"/>
+                  <wp:docPr id="543064573" name="Picture 6"/>
+                  <wp:cNvGraphicFramePr>
+                    <a:graphicFrameLocks xmlns:a="http://schemas.openxmlformats.org/drawingml/2006/main" noChangeAspect="1"/>
+                  </wp:cNvGraphicFramePr>
+                  <a:graphic xmlns:a="http://schemas.openxmlformats.org/drawingml/2006/main">
+                    <a:graphicData uri="http://schemas.openxmlformats.org/drawingml/2006/picture">
+                      <pic:pic xmlns:pic="http://schemas.openxmlformats.org/drawingml/2006/picture">
+                        <pic:nvPicPr>
+                          <pic:cNvPr id="543064573" name="Picture 543064573"/>
+                          <pic:cNvPicPr/>
+                        </pic:nvPicPr>
+                        <pic:blipFill>
+                          <a:blip r:embed="rId11" cstate="print">
+                            <a:extLst>
+                              <a:ext uri="{28A0092B-C50C-407E-A947-70E740481C1C}">
+                                <a14:useLocalDpi xmlns:a14="http://schemas.microsoft.com/office/drawing/2010/main" val="0"/>
+                              </a:ext>
+                            </a:extLst>
+                          </a:blip>
+                          <a:stretch>
+                            <a:fillRect/>
+                          </a:stretch>
+                        </pic:blipFill>
+                        <pic:spPr>
+                          <a:xfrm>
+                            <a:off x="0" y="0"/>
+                            <a:ext cx="5943600" cy="2912110"/>
+                          </a:xfrm>
+                          <a:prstGeom prst="rect">
+                            <a:avLst/>
+                          </a:prstGeom>
+                        </pic:spPr>
+                      </pic:pic>
+                    </a:graphicData>
+                  </a:graphic>
+                </wp:inline>
+              </w:drawing>
             </w:r>
           </w:p>
         </w:tc>
@@ -5575,7 +5655,6 @@
           </w:tcPr>
           <w:p>
             <w:pPr>
-              <w:spacing w:after="0"/>
               <w:ind w:left="115"/>
             </w:pPr>
             <w:r>
@@ -5584,7 +5663,16 @@
                 <w:color w:val="1D2125"/>
                 <w:sz w:val="24"/>
               </w:rPr>
-              <w:t xml:space="preserve">List the issues found here </w:t>
+              <w:lastRenderedPageBreak/>
+              <w:t>No contrast ratio that is of a least 3:1 was not provided, Titles don’t have consistent hierarchy, a page doesn’t contain an h1 element</w:t>
+            </w:r>
+            <w:r>
+              <w:rPr>
+                <w:i/>
+                <w:color w:val="1D2125"/>
+                <w:sz w:val="24"/>
+              </w:rPr>
+              <w:t xml:space="preserve"> </w:t>
             </w:r>
           </w:p>
         </w:tc>
@@ -5608,16 +5696,106 @@
           </w:tcPr>
           <w:p>
             <w:pPr>
-              <w:spacing w:after="0"/>
               <w:ind w:left="115"/>
             </w:pPr>
             <w:r>
               <w:rPr>
-                <w:i/>
-                <w:color w:val="1D2125"/>
-                <w:sz w:val="24"/>
-              </w:rPr>
-              <w:t xml:space="preserve">Insert the HTML validation screenshots here </w:t>
+                <w:noProof/>
+              </w:rPr>
+              <w:lastRenderedPageBreak/>
+              <w:drawing>
+                <wp:inline distT="0" distB="0" distL="0" distR="0" wp14:anchorId="6E4828FD" wp14:editId="04E1DC12">
+                  <wp:extent cx="5943600" cy="4634230"/>
+                  <wp:effectExtent l="0" t="0" r="0" b="0"/>
+                  <wp:docPr id="1740790918" name="Picture 7"/>
+                  <wp:cNvGraphicFramePr>
+                    <a:graphicFrameLocks xmlns:a="http://schemas.openxmlformats.org/drawingml/2006/main" noChangeAspect="1"/>
+                  </wp:cNvGraphicFramePr>
+                  <a:graphic xmlns:a="http://schemas.openxmlformats.org/drawingml/2006/main">
+                    <a:graphicData uri="http://schemas.openxmlformats.org/drawingml/2006/picture">
+                      <pic:pic xmlns:pic="http://schemas.openxmlformats.org/drawingml/2006/picture">
+                        <pic:nvPicPr>
+                          <pic:cNvPr id="1740790918" name="Picture 1740790918"/>
+                          <pic:cNvPicPr/>
+                        </pic:nvPicPr>
+                        <pic:blipFill>
+                          <a:blip r:embed="rId12">
+                            <a:extLst>
+                              <a:ext uri="{28A0092B-C50C-407E-A947-70E740481C1C}">
+                                <a14:useLocalDpi xmlns:a14="http://schemas.microsoft.com/office/drawing/2010/main" val="0"/>
+                              </a:ext>
+                            </a:extLst>
+                          </a:blip>
+                          <a:stretch>
+                            <a:fillRect/>
+                          </a:stretch>
+                        </pic:blipFill>
+                        <pic:spPr>
+                          <a:xfrm>
+                            <a:off x="0" y="0"/>
+                            <a:ext cx="5943600" cy="4634230"/>
+                          </a:xfrm>
+                          <a:prstGeom prst="rect">
+                            <a:avLst/>
+                          </a:prstGeom>
+                        </pic:spPr>
+                      </pic:pic>
+                    </a:graphicData>
+                  </a:graphic>
+                </wp:inline>
+              </w:drawing>
+            </w:r>
+          </w:p>
+          <w:p>
+            <w:pPr>
+              <w:ind w:left="115"/>
+            </w:pPr>
+            <w:r>
+              <w:rPr>
+                <w:noProof/>
+              </w:rPr>
+              <w:lastRenderedPageBreak/>
+              <w:drawing>
+                <wp:inline distT="0" distB="0" distL="0" distR="0" wp14:anchorId="2248121D" wp14:editId="3852C434">
+                  <wp:extent cx="5943600" cy="4258945"/>
+                  <wp:effectExtent l="0" t="0" r="0" b="8255"/>
+                  <wp:docPr id="539441100" name="Picture 8"/>
+                  <wp:cNvGraphicFramePr>
+                    <a:graphicFrameLocks xmlns:a="http://schemas.openxmlformats.org/drawingml/2006/main" noChangeAspect="1"/>
+                  </wp:cNvGraphicFramePr>
+                  <a:graphic xmlns:a="http://schemas.openxmlformats.org/drawingml/2006/main">
+                    <a:graphicData uri="http://schemas.openxmlformats.org/drawingml/2006/picture">
+                      <pic:pic xmlns:pic="http://schemas.openxmlformats.org/drawingml/2006/picture">
+                        <pic:nvPicPr>
+                          <pic:cNvPr id="539441100" name="Picture 539441100"/>
+                          <pic:cNvPicPr/>
+                        </pic:nvPicPr>
+                        <pic:blipFill>
+                          <a:blip r:embed="rId13">
+                            <a:extLst>
+                              <a:ext uri="{28A0092B-C50C-407E-A947-70E740481C1C}">
+                                <a14:useLocalDpi xmlns:a14="http://schemas.microsoft.com/office/drawing/2010/main" val="0"/>
+                              </a:ext>
+                            </a:extLst>
+                          </a:blip>
+                          <a:stretch>
+                            <a:fillRect/>
+                          </a:stretch>
+                        </pic:blipFill>
+                        <pic:spPr>
+                          <a:xfrm>
+                            <a:off x="0" y="0"/>
+                            <a:ext cx="5943600" cy="4258945"/>
+                          </a:xfrm>
+                          <a:prstGeom prst="rect">
+                            <a:avLst/>
+                          </a:prstGeom>
+                        </pic:spPr>
+                      </pic:pic>
+                    </a:graphicData>
+                  </a:graphic>
+                </wp:inline>
+              </w:drawing>
             </w:r>
           </w:p>
         </w:tc>
@@ -5641,7 +5819,6 @@
           </w:tcPr>
           <w:p>
             <w:pPr>
-              <w:spacing w:after="0"/>
               <w:ind w:left="115"/>
             </w:pPr>
             <w:r>
@@ -5650,7 +5827,8 @@
                 <w:color w:val="1D2125"/>
                 <w:sz w:val="24"/>
               </w:rPr>
-              <w:t xml:space="preserve">List the Markup issues found here </w:t>
+              <w:lastRenderedPageBreak/>
+              <w:t>Had 14  space not allowed errors and 2 skipping 1 heading level errors</w:t>
             </w:r>
           </w:p>
         </w:tc>
@@ -5674,7 +5852,6 @@
           </w:tcPr>
           <w:p>
             <w:pPr>
-              <w:spacing w:after="0"/>
               <w:ind w:left="115"/>
             </w:pPr>
             <w:r>
@@ -5707,7 +5884,6 @@
           </w:tcPr>
           <w:p>
             <w:pPr>
-              <w:spacing w:after="0"/>
               <w:ind w:left="115"/>
             </w:pPr>
             <w:r>
@@ -5740,7 +5916,6 @@
           </w:tcPr>
           <w:p>
             <w:pPr>
-              <w:spacing w:after="0"/>
               <w:ind w:left="115"/>
             </w:pPr>
             <w:r>
@@ -5773,7 +5948,6 @@
           </w:tcPr>
           <w:p>
             <w:pPr>
-              <w:spacing w:after="0"/>
               <w:ind w:left="115"/>
             </w:pPr>
             <w:r>
@@ -5806,7 +5980,6 @@
           </w:tcPr>
           <w:p>
             <w:pPr>
-              <w:spacing w:after="0"/>
               <w:ind w:left="115"/>
             </w:pPr>
             <w:r>
@@ -5852,9 +6025,6 @@
             </w:r>
           </w:p>
           <w:p>
-            <w:pPr>
-              <w:spacing w:after="0"/>
-            </w:pPr>
             <w:r>
               <w:rPr>
                 <w:b/>
@@ -5885,7 +6055,6 @@
           </w:tcPr>
           <w:p>
             <w:pPr>
-              <w:spacing w:after="0"/>
               <w:ind w:left="59"/>
               <w:jc w:val="center"/>
             </w:pPr>
@@ -5919,7 +6088,7 @@
           </w:tcPr>
           <w:p>
             <w:pPr>
-              <w:spacing w:after="0" w:line="238" w:lineRule="auto"/>
+              <w:spacing w:line="238" w:lineRule="auto"/>
               <w:ind w:left="115"/>
             </w:pPr>
             <w:r>
@@ -5955,7 +6124,7 @@
                 <w:ilvl w:val="0"/>
                 <w:numId w:val="5"/>
               </w:numPr>
-              <w:spacing w:after="0" w:line="270" w:lineRule="auto"/>
+              <w:spacing w:line="270" w:lineRule="auto"/>
               <w:ind w:left="959" w:right="74" w:hanging="361"/>
             </w:pPr>
             <w:r>
@@ -5969,7 +6138,6 @@
           </w:p>
           <w:p>
             <w:pPr>
-              <w:spacing w:after="0"/>
               <w:ind w:left="115"/>
             </w:pPr>
             <w:r>
@@ -6002,7 +6170,6 @@
           </w:tcPr>
           <w:p>
             <w:pPr>
-              <w:spacing w:after="0"/>
               <w:ind w:left="62"/>
               <w:jc w:val="center"/>
             </w:pPr>
@@ -6036,7 +6203,6 @@
           </w:tcPr>
           <w:p>
             <w:pPr>
-              <w:spacing w:after="0"/>
               <w:ind w:left="115"/>
             </w:pPr>
             <w:r>
@@ -6069,7 +6235,6 @@
           </w:tcPr>
           <w:p>
             <w:pPr>
-              <w:spacing w:after="0"/>
               <w:ind w:left="60"/>
               <w:jc w:val="center"/>
             </w:pPr>
@@ -6079,6 +6244,7 @@
                 <w:color w:val="1D2125"/>
                 <w:sz w:val="24"/>
               </w:rPr>
+              <w:lastRenderedPageBreak/>
               <w:t xml:space="preserve">HTML Markup issues </w:t>
             </w:r>
           </w:p>
@@ -6103,7 +6269,6 @@
           </w:tcPr>
           <w:p>
             <w:pPr>
-              <w:spacing w:after="0"/>
               <w:ind w:left="115"/>
               <w:jc w:val="both"/>
             </w:pPr>
@@ -6143,7 +6308,6 @@
           <w:rFonts w:ascii="Arial" w:eastAsia="Arial" w:hAnsi="Arial" w:cs="Arial"/>
           <w:b/>
         </w:rPr>
-        <w:lastRenderedPageBreak/>
         <w:t xml:space="preserve"> </w:t>
       </w:r>
     </w:p>
@@ -7989,6 +8153,7 @@
   <w:style w:type="character" w:default="1" w:styleId="DefaultParagraphFont">
     <w:name w:val="Default Paragraph Font"/>
     <w:uiPriority w:val="1"/>
+    <w:semiHidden/>
     <w:unhideWhenUsed/>
   </w:style>
   <w:style w:type="table" w:default="1" w:styleId="TableNormal">

</xml_diff>